<commit_message>
Stable checkpoint: Complete Electron + .NET ExcelReplacement application
- Full Electron frontend with working file dialogs and drag-and-drop
- .NET 8 Web API backend with file processing capabilities
- Excel and Word template processing with proper formatting preservation
- File locking handling with unique filename generation
- Configure filename pattern with real-time preview
- Template validation and management
- Complete test data and documentation
- All core functionality working and tested
</commit_message>
<xml_diff>
--- a/test-data/templates/template.docx
+++ b/test-data/templates/template.docx
@@ -38,26 +38,27 @@
     <w:tbl>
       <w:tblPr>
         <w:tblStyle w:val="PlainTable1"/>
-        <w:tblW w:w="0" w:type="auto"/>
+        <w:tblW w:w="10500" w:type="dxa"/>
         <w:tblLook w:val="0420" w:firstRow="1" w:lastRow="0" w:firstColumn="0" w:lastColumn="0" w:noHBand="0" w:noVBand="1"/>
       </w:tblPr>
       <w:tblGrid>
-        <w:gridCol w:w="1255"/>
-        <w:gridCol w:w="1121"/>
-        <w:gridCol w:w="1357"/>
-        <w:gridCol w:w="1757"/>
-        <w:gridCol w:w="966"/>
-        <w:gridCol w:w="855"/>
-        <w:gridCol w:w="1106"/>
-        <w:gridCol w:w="933"/>
+        <w:gridCol w:w="1404"/>
+        <w:gridCol w:w="1256"/>
+        <w:gridCol w:w="1522"/>
+        <w:gridCol w:w="1962"/>
+        <w:gridCol w:w="1083"/>
+        <w:gridCol w:w="991"/>
+        <w:gridCol w:w="1238"/>
+        <w:gridCol w:w="1044"/>
       </w:tblGrid>
       <w:tr>
         <w:trPr>
           <w:cnfStyle w:val="100000000000" w:firstRow="1" w:lastRow="0" w:firstColumn="0" w:lastColumn="0" w:oddVBand="0" w:evenVBand="0" w:oddHBand="0" w:evenHBand="0" w:firstRowFirstColumn="0" w:firstRowLastColumn="0" w:lastRowFirstColumn="0" w:lastRowLastColumn="0"/>
+          <w:trHeight w:val="608"/>
         </w:trPr>
         <w:tc>
           <w:tcPr>
-            <w:tcW w:w="1168" w:type="dxa"/>
+            <w:tcW w:w="1407" w:type="dxa"/>
           </w:tcPr>
           <w:p>
             <w:r>
@@ -67,7 +68,7 @@
         </w:tc>
         <w:tc>
           <w:tcPr>
-            <w:tcW w:w="1168" w:type="dxa"/>
+            <w:tcW w:w="1258" w:type="dxa"/>
           </w:tcPr>
           <w:p>
             <w:r>
@@ -77,7 +78,7 @@
         </w:tc>
         <w:tc>
           <w:tcPr>
-            <w:tcW w:w="1169" w:type="dxa"/>
+            <w:tcW w:w="1522" w:type="dxa"/>
           </w:tcPr>
           <w:p>
             <w:r>
@@ -87,7 +88,7 @@
         </w:tc>
         <w:tc>
           <w:tcPr>
-            <w:tcW w:w="1169" w:type="dxa"/>
+            <w:tcW w:w="1972" w:type="dxa"/>
           </w:tcPr>
           <w:p>
             <w:r>
@@ -97,7 +98,7 @@
         </w:tc>
         <w:tc>
           <w:tcPr>
-            <w:tcW w:w="1169" w:type="dxa"/>
+            <w:tcW w:w="1085" w:type="dxa"/>
           </w:tcPr>
           <w:p>
             <w:r>
@@ -107,7 +108,7 @@
         </w:tc>
         <w:tc>
           <w:tcPr>
-            <w:tcW w:w="1169" w:type="dxa"/>
+            <w:tcW w:w="969" w:type="dxa"/>
           </w:tcPr>
           <w:p>
             <w:r>
@@ -117,7 +118,7 @@
         </w:tc>
         <w:tc>
           <w:tcPr>
-            <w:tcW w:w="1169" w:type="dxa"/>
+            <w:tcW w:w="1241" w:type="dxa"/>
           </w:tcPr>
           <w:p>
             <w:r>
@@ -127,7 +128,7 @@
         </w:tc>
         <w:tc>
           <w:tcPr>
-            <w:tcW w:w="1169" w:type="dxa"/>
+            <w:tcW w:w="1046" w:type="dxa"/>
           </w:tcPr>
           <w:p>
             <w:r>
@@ -139,10 +140,11 @@
       <w:tr>
         <w:trPr>
           <w:cnfStyle w:val="000000100000" w:firstRow="0" w:lastRow="0" w:firstColumn="0" w:lastColumn="0" w:oddVBand="0" w:evenVBand="0" w:oddHBand="1" w:evenHBand="0" w:firstRowFirstColumn="0" w:firstRowLastColumn="0" w:lastRowFirstColumn="0" w:lastRowLastColumn="0"/>
+          <w:trHeight w:val="904"/>
         </w:trPr>
         <w:tc>
           <w:tcPr>
-            <w:tcW w:w="1168" w:type="dxa"/>
+            <w:tcW w:w="1407" w:type="dxa"/>
           </w:tcPr>
           <w:p>
             <w:r>
@@ -152,362 +154,241 @@
         </w:tc>
         <w:tc>
           <w:tcPr>
-            <w:tcW w:w="1168" w:type="dxa"/>
+            <w:tcW w:w="1258" w:type="dxa"/>
           </w:tcPr>
           <w:p>
+            <w:pPr>
+              <w:rPr>
+                <w:b/>
+                <w:bCs/>
+              </w:rPr>
+            </w:pPr>
             <w:r>
+              <w:rPr>
+                <w:b/>
+                <w:bCs/>
+              </w:rPr>
               <w:t>[Facility]</w:t>
             </w:r>
           </w:p>
         </w:tc>
         <w:tc>
           <w:tcPr>
-            <w:tcW w:w="1169" w:type="dxa"/>
+            <w:tcW w:w="1522" w:type="dxa"/>
           </w:tcPr>
           <w:p>
             <w:r>
-              <w:t>[Equipment]</w:t>
+              <w:t>Test [Equipment]</w:t>
             </w:r>
           </w:p>
         </w:tc>
         <w:tc>
           <w:tcPr>
-            <w:tcW w:w="1169" w:type="dxa"/>
+            <w:tcW w:w="1972" w:type="dxa"/>
+          </w:tcPr>
+          <w:p/>
+        </w:tc>
+        <w:tc>
+          <w:tcPr>
+            <w:tcW w:w="1085" w:type="dxa"/>
+          </w:tcPr>
+          <w:p/>
+        </w:tc>
+        <w:tc>
+          <w:tcPr>
+            <w:tcW w:w="969" w:type="dxa"/>
           </w:tcPr>
           <w:p>
             <w:r>
-              <w:t>Step 1. Do [Procedure] on [Equipment]</w:t>
+              <w:rPr>
+                <w:b/>
+                <w:bCs/>
+              </w:rPr>
+              <w:t>[Panel-1]</w:t>
+            </w:r>
+            <w:r>
+              <w:rPr>
+                <w:b/>
+                <w:bCs/>
+              </w:rPr>
+              <w:t xml:space="preserve"> </w:t>
+            </w:r>
+            <w:r>
+              <w:t>is the best.</w:t>
             </w:r>
           </w:p>
         </w:tc>
         <w:tc>
           <w:tcPr>
-            <w:tcW w:w="1169" w:type="dxa"/>
-          </w:tcPr>
-          <w:p>
-            <w:r>
-              <w:t>[Lineup]</w:t>
-            </w:r>
-          </w:p>
-        </w:tc>
-        <w:tc>
-          <w:tcPr>
-            <w:tcW w:w="1169" w:type="dxa"/>
-          </w:tcPr>
-          <w:p>
-            <w:r>
-              <w:t>[Panel]</w:t>
-            </w:r>
-          </w:p>
-        </w:tc>
-        <w:tc>
-          <w:tcPr>
-            <w:tcW w:w="1169" w:type="dxa"/>
-          </w:tcPr>
-          <w:p>
-            <w:r>
-              <w:t>[Breaker]</w:t>
-            </w:r>
-          </w:p>
-        </w:tc>
-        <w:tc>
-          <w:tcPr>
-            <w:tcW w:w="1169" w:type="dxa"/>
-          </w:tcPr>
-          <w:p>
-            <w:r>
-              <w:t>[Status]</w:t>
-            </w:r>
-          </w:p>
+            <w:tcW w:w="1241" w:type="dxa"/>
+          </w:tcPr>
+          <w:p/>
+        </w:tc>
+        <w:tc>
+          <w:tcPr>
+            <w:tcW w:w="1046" w:type="dxa"/>
+          </w:tcPr>
+          <w:p/>
         </w:tc>
       </w:tr>
       <w:tr>
-        <w:tc>
-          <w:tcPr>
-            <w:tcW w:w="1168" w:type="dxa"/>
-          </w:tcPr>
-          <w:p>
-            <w:r>
-              <w:t>[Location1]</w:t>
-            </w:r>
-          </w:p>
-        </w:tc>
-        <w:tc>
-          <w:tcPr>
-            <w:tcW w:w="1168" w:type="dxa"/>
-          </w:tcPr>
-          <w:p>
-            <w:r>
-              <w:t>[</w:t>
-            </w:r>
-            <w:proofErr w:type="spellStart"/>
-            <w:r>
-              <w:t>FacilityA</w:t>
-            </w:r>
-            <w:proofErr w:type="spellEnd"/>
-            <w:r>
-              <w:t>]</w:t>
-            </w:r>
-          </w:p>
-        </w:tc>
-        <w:tc>
-          <w:tcPr>
-            <w:tcW w:w="1169" w:type="dxa"/>
-          </w:tcPr>
-          <w:p>
-            <w:r>
-              <w:t>[Equipment-01]</w:t>
-            </w:r>
-          </w:p>
-        </w:tc>
-        <w:tc>
-          <w:tcPr>
-            <w:tcW w:w="1169" w:type="dxa"/>
-          </w:tcPr>
-          <w:p>
-            <w:r>
-              <w:t>&lt;b&gt;Step 2. Open [MP-11] for [CKT-34/36/</w:t>
-            </w:r>
-            <w:proofErr w:type="gramStart"/>
-            <w:r>
-              <w:t>38]&lt;</w:t>
-            </w:r>
-            <w:proofErr w:type="gramEnd"/>
-            <w:r>
-              <w:t>/b&gt;</w:t>
-            </w:r>
-          </w:p>
-        </w:tc>
-        <w:tc>
-          <w:tcPr>
-            <w:tcW w:w="1169" w:type="dxa"/>
-          </w:tcPr>
-          <w:p>
-            <w:r>
-              <w:t>[A1]</w:t>
-            </w:r>
-          </w:p>
-        </w:tc>
-        <w:tc>
-          <w:tcPr>
-            <w:tcW w:w="1169" w:type="dxa"/>
-          </w:tcPr>
-          <w:p>
-            <w:r>
-              <w:t>[MP-11]</w:t>
-            </w:r>
-          </w:p>
-        </w:tc>
-        <w:tc>
-          <w:tcPr>
-            <w:tcW w:w="1169" w:type="dxa"/>
-          </w:tcPr>
-          <w:p>
-            <w:r>
-              <w:t>[CKT-34/36/38]</w:t>
-            </w:r>
-          </w:p>
-        </w:tc>
-        <w:tc>
-          <w:tcPr>
-            <w:tcW w:w="1169" w:type="dxa"/>
-          </w:tcPr>
-          <w:p>
-            <w:r>
-              <w:t>[Active]</w:t>
-            </w:r>
-          </w:p>
+        <w:trPr>
+          <w:trHeight w:val="1216"/>
+        </w:trPr>
+        <w:tc>
+          <w:tcPr>
+            <w:tcW w:w="1407" w:type="dxa"/>
+          </w:tcPr>
+          <w:p/>
+        </w:tc>
+        <w:tc>
+          <w:tcPr>
+            <w:tcW w:w="1258" w:type="dxa"/>
+          </w:tcPr>
+          <w:p/>
+        </w:tc>
+        <w:tc>
+          <w:tcPr>
+            <w:tcW w:w="1522" w:type="dxa"/>
+          </w:tcPr>
+          <w:p/>
+        </w:tc>
+        <w:tc>
+          <w:tcPr>
+            <w:tcW w:w="1972" w:type="dxa"/>
+          </w:tcPr>
+          <w:p/>
+        </w:tc>
+        <w:tc>
+          <w:tcPr>
+            <w:tcW w:w="1085" w:type="dxa"/>
+          </w:tcPr>
+          <w:p/>
+        </w:tc>
+        <w:tc>
+          <w:tcPr>
+            <w:tcW w:w="969" w:type="dxa"/>
+          </w:tcPr>
+          <w:p/>
+        </w:tc>
+        <w:tc>
+          <w:tcPr>
+            <w:tcW w:w="1241" w:type="dxa"/>
+          </w:tcPr>
+          <w:p/>
+        </w:tc>
+        <w:tc>
+          <w:tcPr>
+            <w:tcW w:w="1046" w:type="dxa"/>
+          </w:tcPr>
+          <w:p/>
         </w:tc>
       </w:tr>
       <w:tr>
         <w:trPr>
           <w:cnfStyle w:val="000000100000" w:firstRow="0" w:lastRow="0" w:firstColumn="0" w:lastColumn="0" w:oddVBand="0" w:evenVBand="0" w:oddHBand="1" w:evenHBand="0" w:firstRowFirstColumn="0" w:firstRowLastColumn="0" w:lastRowFirstColumn="0" w:lastRowLastColumn="0"/>
+          <w:trHeight w:val="1825"/>
         </w:trPr>
         <w:tc>
           <w:tcPr>
-            <w:tcW w:w="1168" w:type="dxa"/>
-          </w:tcPr>
-          <w:p>
-            <w:r>
-              <w:t>[Location1]</w:t>
-            </w:r>
-          </w:p>
-        </w:tc>
-        <w:tc>
-          <w:tcPr>
-            <w:tcW w:w="1168" w:type="dxa"/>
-          </w:tcPr>
-          <w:p>
-            <w:r>
-              <w:t>[</w:t>
-            </w:r>
-            <w:proofErr w:type="spellStart"/>
-            <w:r>
-              <w:t>FacilityA</w:t>
-            </w:r>
-            <w:proofErr w:type="spellEnd"/>
-            <w:r>
-              <w:t>]</w:t>
-            </w:r>
-          </w:p>
-        </w:tc>
-        <w:tc>
-          <w:tcPr>
-            <w:tcW w:w="1169" w:type="dxa"/>
-          </w:tcPr>
-          <w:p>
-            <w:r>
-              <w:t>[Equipment-01]</w:t>
-            </w:r>
-          </w:p>
-        </w:tc>
-        <w:tc>
-          <w:tcPr>
-            <w:tcW w:w="1169" w:type="dxa"/>
-          </w:tcPr>
-          <w:p>
-            <w:r>
-              <w:t>&lt;b&gt;Step 3. Apply LOTO (Lockout/Tagout) on [Equipment-</w:t>
-            </w:r>
-            <w:proofErr w:type="gramStart"/>
-            <w:r>
-              <w:t>01]&lt;</w:t>
-            </w:r>
-            <w:proofErr w:type="gramEnd"/>
-            <w:r>
-              <w:t>/b&gt;</w:t>
-            </w:r>
-          </w:p>
-        </w:tc>
-        <w:tc>
-          <w:tcPr>
-            <w:tcW w:w="1169" w:type="dxa"/>
-          </w:tcPr>
-          <w:p>
-            <w:r>
-              <w:t>[A1]</w:t>
-            </w:r>
-          </w:p>
-        </w:tc>
-        <w:tc>
-          <w:tcPr>
-            <w:tcW w:w="1169" w:type="dxa"/>
-          </w:tcPr>
-          <w:p>
-            <w:r>
-              <w:t>[MP-11]</w:t>
-            </w:r>
-          </w:p>
-        </w:tc>
-        <w:tc>
-          <w:tcPr>
-            <w:tcW w:w="1169" w:type="dxa"/>
-          </w:tcPr>
-          <w:p>
-            <w:r>
-              <w:t>[CKT-34/36/38]</w:t>
-            </w:r>
-          </w:p>
-        </w:tc>
-        <w:tc>
-          <w:tcPr>
-            <w:tcW w:w="1169" w:type="dxa"/>
-          </w:tcPr>
-          <w:p>
-            <w:r>
-              <w:t>[Active]</w:t>
-            </w:r>
-          </w:p>
+            <w:tcW w:w="1407" w:type="dxa"/>
+          </w:tcPr>
+          <w:p/>
+        </w:tc>
+        <w:tc>
+          <w:tcPr>
+            <w:tcW w:w="1258" w:type="dxa"/>
+          </w:tcPr>
+          <w:p/>
+        </w:tc>
+        <w:tc>
+          <w:tcPr>
+            <w:tcW w:w="1522" w:type="dxa"/>
+          </w:tcPr>
+          <w:p/>
+        </w:tc>
+        <w:tc>
+          <w:tcPr>
+            <w:tcW w:w="1972" w:type="dxa"/>
+          </w:tcPr>
+          <w:p/>
+        </w:tc>
+        <w:tc>
+          <w:tcPr>
+            <w:tcW w:w="1085" w:type="dxa"/>
+          </w:tcPr>
+          <w:p/>
+        </w:tc>
+        <w:tc>
+          <w:tcPr>
+            <w:tcW w:w="969" w:type="dxa"/>
+          </w:tcPr>
+          <w:p/>
+        </w:tc>
+        <w:tc>
+          <w:tcPr>
+            <w:tcW w:w="1241" w:type="dxa"/>
+          </w:tcPr>
+          <w:p/>
+        </w:tc>
+        <w:tc>
+          <w:tcPr>
+            <w:tcW w:w="1046" w:type="dxa"/>
+          </w:tcPr>
+          <w:p/>
         </w:tc>
       </w:tr>
       <w:tr>
-        <w:tc>
-          <w:tcPr>
-            <w:tcW w:w="1168" w:type="dxa"/>
-          </w:tcPr>
-          <w:p>
-            <w:r>
-              <w:t>[Location1]</w:t>
-            </w:r>
-          </w:p>
-        </w:tc>
-        <w:tc>
-          <w:tcPr>
-            <w:tcW w:w="1168" w:type="dxa"/>
-          </w:tcPr>
-          <w:p>
-            <w:r>
-              <w:t>[</w:t>
-            </w:r>
-            <w:proofErr w:type="spellStart"/>
-            <w:r>
-              <w:t>FacilityA</w:t>
-            </w:r>
-            <w:proofErr w:type="spellEnd"/>
-            <w:r>
-              <w:t>]</w:t>
-            </w:r>
-          </w:p>
-        </w:tc>
-        <w:tc>
-          <w:tcPr>
-            <w:tcW w:w="1169" w:type="dxa"/>
-          </w:tcPr>
-          <w:p>
-            <w:r>
-              <w:t>[Equipment-01]</w:t>
-            </w:r>
-          </w:p>
-        </w:tc>
-        <w:tc>
-          <w:tcPr>
-            <w:tcW w:w="1169" w:type="dxa"/>
-          </w:tcPr>
-          <w:p>
-            <w:r>
-              <w:t>&lt;b&gt;Step 4. Verify LOTO is applied correctly&lt;/b&gt;</w:t>
-            </w:r>
-          </w:p>
-        </w:tc>
-        <w:tc>
-          <w:tcPr>
-            <w:tcW w:w="1169" w:type="dxa"/>
-          </w:tcPr>
-          <w:p>
-            <w:r>
-              <w:t>[A1]</w:t>
-            </w:r>
-          </w:p>
-        </w:tc>
-        <w:tc>
-          <w:tcPr>
-            <w:tcW w:w="1169" w:type="dxa"/>
-          </w:tcPr>
-          <w:p>
-            <w:r>
-              <w:t>[MP-11]</w:t>
-            </w:r>
-          </w:p>
-        </w:tc>
-        <w:tc>
-          <w:tcPr>
-            <w:tcW w:w="1169" w:type="dxa"/>
-          </w:tcPr>
-          <w:p>
-            <w:r>
-              <w:t>[CKT-34/36/38]</w:t>
-            </w:r>
-          </w:p>
-        </w:tc>
-        <w:tc>
-          <w:tcPr>
-            <w:tcW w:w="1169" w:type="dxa"/>
-          </w:tcPr>
-          <w:p>
-            <w:r>
-              <w:t>[Active]</w:t>
-            </w:r>
-          </w:p>
+        <w:trPr>
+          <w:trHeight w:val="1201"/>
+        </w:trPr>
+        <w:tc>
+          <w:tcPr>
+            <w:tcW w:w="1407" w:type="dxa"/>
+          </w:tcPr>
+          <w:p/>
+        </w:tc>
+        <w:tc>
+          <w:tcPr>
+            <w:tcW w:w="1258" w:type="dxa"/>
+          </w:tcPr>
+          <w:p/>
+        </w:tc>
+        <w:tc>
+          <w:tcPr>
+            <w:tcW w:w="1522" w:type="dxa"/>
+          </w:tcPr>
+          <w:p/>
+        </w:tc>
+        <w:tc>
+          <w:tcPr>
+            <w:tcW w:w="1972" w:type="dxa"/>
+          </w:tcPr>
+          <w:p/>
+        </w:tc>
+        <w:tc>
+          <w:tcPr>
+            <w:tcW w:w="1085" w:type="dxa"/>
+          </w:tcPr>
+          <w:p/>
+        </w:tc>
+        <w:tc>
+          <w:tcPr>
+            <w:tcW w:w="969" w:type="dxa"/>
+          </w:tcPr>
+          <w:p/>
+        </w:tc>
+        <w:tc>
+          <w:tcPr>
+            <w:tcW w:w="1241" w:type="dxa"/>
+          </w:tcPr>
+          <w:p/>
+        </w:tc>
+        <w:tc>
+          <w:tcPr>
+            <w:tcW w:w="1046" w:type="dxa"/>
+          </w:tcPr>
+          <w:p/>
         </w:tc>
       </w:tr>
     </w:tbl>

</xml_diff>